<commit_message>
sprint 1 doc upload
</commit_message>
<xml_diff>
--- a/docs/CloudGuard_Sprint1.docx
+++ b/docs/CloudGuard_Sprint1.docx
@@ -118,15 +118,7 @@
           <w:sz w:val="20"/>
           <w:szCs w:val="20"/>
         </w:rPr>
-        <w:t xml:space="preserve">Repository: </w:t>
-      </w:r>
-      <w:r>
-        <w:rPr>
-          <w:color w:val="5A6474"/>
-          <w:sz w:val="20"/>
-          <w:szCs w:val="20"/>
-        </w:rPr>
-        <w:t>https://github.com/manuleague/cloudguard-compliance-engine</w:t>
+        <w:t xml:space="preserve">Repository: https://github.com/manuleague/cloudguard-compliance-engine</w:t>
       </w:r>
     </w:p>
     <w:p>
@@ -171,12 +163,6 @@
           <w:bCs/>
         </w:rPr>
         <w:t>1. Tema și descrierea aplicației</w:t>
-      </w:r>
-      <w:r>
-        <w:rPr>
-          <w:b/>
-          <w:bCs/>
-        </w:rPr>
         <w:tab/>
         <w:t>3</w:t>
       </w:r>
@@ -195,12 +181,6 @@
           <w:szCs w:val="20"/>
         </w:rPr>
         <w:t>1.1 Arhitectura pe straturi</w:t>
-      </w:r>
-      <w:r>
-        <w:rPr>
-          <w:sz w:val="20"/>
-          <w:szCs w:val="20"/>
-        </w:rPr>
         <w:tab/>
         <w:t>3</w:t>
       </w:r>
@@ -218,12 +198,6 @@
           <w:bCs/>
         </w:rPr>
         <w:t>2. Echipa</w:t>
-      </w:r>
-      <w:r>
-        <w:rPr>
-          <w:b/>
-          <w:bCs/>
-        </w:rPr>
         <w:tab/>
         <w:t>3</w:t>
       </w:r>
@@ -241,12 +215,6 @@
           <w:bCs/>
         </w:rPr>
         <w:t>3. Cerințe de business</w:t>
-      </w:r>
-      <w:r>
-        <w:rPr>
-          <w:b/>
-          <w:bCs/>
-        </w:rPr>
         <w:tab/>
         <w:t>3</w:t>
       </w:r>
@@ -265,12 +233,6 @@
           <w:szCs w:val="20"/>
         </w:rPr>
         <w:t>3.1 Actori</w:t>
-      </w:r>
-      <w:r>
-        <w:rPr>
-          <w:sz w:val="20"/>
-          <w:szCs w:val="20"/>
-        </w:rPr>
         <w:tab/>
         <w:t>3</w:t>
       </w:r>
@@ -289,12 +251,6 @@
           <w:szCs w:val="20"/>
         </w:rPr>
         <w:t>3.2 Cerințe funcționale</w:t>
-      </w:r>
-      <w:r>
-        <w:rPr>
-          <w:sz w:val="20"/>
-          <w:szCs w:val="20"/>
-        </w:rPr>
         <w:tab/>
         <w:t>4</w:t>
       </w:r>
@@ -313,12 +269,6 @@
           <w:szCs w:val="20"/>
         </w:rPr>
         <w:t>3.3 Cerințe nefuncționale</w:t>
-      </w:r>
-      <w:r>
-        <w:rPr>
-          <w:sz w:val="20"/>
-          <w:szCs w:val="20"/>
-        </w:rPr>
         <w:tab/>
         <w:t>4</w:t>
       </w:r>
@@ -336,12 +286,6 @@
           <w:bCs/>
         </w:rPr>
         <w:t>4. Backlog inițial</w:t>
-      </w:r>
-      <w:r>
-        <w:rPr>
-          <w:b/>
-          <w:bCs/>
-        </w:rPr>
         <w:tab/>
         <w:t>4</w:t>
       </w:r>
@@ -360,12 +304,6 @@
           <w:szCs w:val="20"/>
         </w:rPr>
         <w:t>4.1 Epics</w:t>
-      </w:r>
-      <w:r>
-        <w:rPr>
-          <w:sz w:val="20"/>
-          <w:szCs w:val="20"/>
-        </w:rPr>
         <w:tab/>
         <w:t>4</w:t>
       </w:r>
@@ -384,12 +322,6 @@
           <w:szCs w:val="20"/>
         </w:rPr>
         <w:t>4.2 User stories</w:t>
-      </w:r>
-      <w:r>
-        <w:rPr>
-          <w:sz w:val="20"/>
-          <w:szCs w:val="20"/>
-        </w:rPr>
         <w:tab/>
         <w:t>4</w:t>
       </w:r>
@@ -407,12 +339,6 @@
           <w:bCs/>
         </w:rPr>
         <w:t>5. Diagrama use case</w:t>
-      </w:r>
-      <w:r>
-        <w:rPr>
-          <w:b/>
-          <w:bCs/>
-        </w:rPr>
         <w:tab/>
         <w:t>6</w:t>
       </w:r>
@@ -430,12 +356,6 @@
           <w:bCs/>
         </w:rPr>
         <w:t>6. Business workflow (diagrama de activitate)</w:t>
-      </w:r>
-      <w:r>
-        <w:rPr>
-          <w:b/>
-          <w:bCs/>
-        </w:rPr>
         <w:tab/>
         <w:t>7</w:t>
       </w:r>
@@ -453,12 +373,6 @@
           <w:bCs/>
         </w:rPr>
         <w:t>7. Modelul de domeniu</w:t>
-      </w:r>
-      <w:r>
-        <w:rPr>
-          <w:b/>
-          <w:bCs/>
-        </w:rPr>
         <w:tab/>
         <w:t>8</w:t>
       </w:r>
@@ -477,12 +391,6 @@
           <w:szCs w:val="20"/>
         </w:rPr>
         <w:t>7.1 Entități</w:t>
-      </w:r>
-      <w:r>
-        <w:rPr>
-          <w:sz w:val="20"/>
-          <w:szCs w:val="20"/>
-        </w:rPr>
         <w:tab/>
         <w:t>8</w:t>
       </w:r>
@@ -501,12 +409,6 @@
           <w:szCs w:val="20"/>
         </w:rPr>
         <w:t>7.2 Agregate</w:t>
-      </w:r>
-      <w:r>
-        <w:rPr>
-          <w:sz w:val="20"/>
-          <w:szCs w:val="20"/>
-        </w:rPr>
         <w:tab/>
         <w:t>8</w:t>
       </w:r>
@@ -525,12 +427,6 @@
           <w:szCs w:val="20"/>
         </w:rPr>
         <w:t>7.3 Relații între entități</w:t>
-      </w:r>
-      <w:r>
-        <w:rPr>
-          <w:sz w:val="20"/>
-          <w:szCs w:val="20"/>
-        </w:rPr>
         <w:tab/>
         <w:t>8</w:t>
       </w:r>
@@ -549,12 +445,6 @@
           <w:szCs w:val="20"/>
         </w:rPr>
         <w:t>7.4 Diagrama de clase UML</w:t>
-      </w:r>
-      <w:r>
-        <w:rPr>
-          <w:sz w:val="20"/>
-          <w:szCs w:val="20"/>
-        </w:rPr>
         <w:tab/>
         <w:t>9</w:t>
       </w:r>
@@ -572,12 +462,6 @@
           <w:bCs/>
         </w:rPr>
         <w:t>8. Diagrama SQL</w:t>
-      </w:r>
-      <w:r>
-        <w:rPr>
-          <w:b/>
-          <w:bCs/>
-        </w:rPr>
         <w:tab/>
         <w:t>10</w:t>
       </w:r>
@@ -595,12 +479,6 @@
           <w:bCs/>
         </w:rPr>
         <w:t>9. Reguli de business</w:t>
-      </w:r>
-      <w:r>
-        <w:rPr>
-          <w:b/>
-          <w:bCs/>
-        </w:rPr>
         <w:tab/>
         <w:t>10</w:t>
       </w:r>
@@ -619,12 +497,6 @@
           <w:szCs w:val="20"/>
         </w:rPr>
         <w:t>9.1 Reguli de validare pe câmpuri</w:t>
-      </w:r>
-      <w:r>
-        <w:rPr>
-          <w:sz w:val="20"/>
-          <w:szCs w:val="20"/>
-        </w:rPr>
         <w:tab/>
         <w:t>10</w:t>
       </w:r>
@@ -643,12 +515,6 @@
           <w:szCs w:val="20"/>
         </w:rPr>
         <w:t>9.2 Reguli la nivel de agregat</w:t>
-      </w:r>
-      <w:r>
-        <w:rPr>
-          <w:sz w:val="20"/>
-          <w:szCs w:val="20"/>
-        </w:rPr>
         <w:tab/>
         <w:t>11</w:t>
       </w:r>
@@ -667,12 +533,6 @@
           <w:szCs w:val="20"/>
         </w:rPr>
         <w:t>9.3 Reguli de calcul</w:t>
-      </w:r>
-      <w:r>
-        <w:rPr>
-          <w:sz w:val="20"/>
-          <w:szCs w:val="20"/>
-        </w:rPr>
         <w:tab/>
         <w:t>11</w:t>
       </w:r>
@@ -690,12 +550,6 @@
           <w:bCs/>
         </w:rPr>
         <w:t>10. ADR 001 — Alegerea stack-ului tehnologic</w:t>
-      </w:r>
-      <w:r>
-        <w:rPr>
-          <w:b/>
-          <w:bCs/>
-        </w:rPr>
         <w:tab/>
         <w:t>11</w:t>
       </w:r>
@@ -713,12 +567,6 @@
           <w:bCs/>
         </w:rPr>
         <w:t>11. Diagrama C4 — nivel Context</w:t>
-      </w:r>
-      <w:r>
-        <w:rPr>
-          <w:b/>
-          <w:bCs/>
-        </w:rPr>
         <w:tab/>
         <w:t>12</w:t>
       </w:r>
@@ -736,12 +584,6 @@
           <w:bCs/>
         </w:rPr>
         <w:t>12. Organizarea proiectului</w:t>
-      </w:r>
-      <w:r>
-        <w:rPr>
-          <w:b/>
-          <w:bCs/>
-        </w:rPr>
         <w:tab/>
         <w:t>12</w:t>
       </w:r>
@@ -9386,7 +9228,7 @@
         <w:t>Taskuri:</w:t>
       </w:r>
       <w:r>
-        <w:t xml:space="preserve"> GitHub Projects, cu un board Kanban (To Do → In Progress → Done); fiecare user story este un issue.</w:t>
+        <w:t xml:space="preserve"> Jira (proiectul SCRUM, danalacheemanuel.atlassian.net): epicii E1–E4, user stories US-01…US-05 și taskurile fiecărui sprint, pe un board Scrum (To Do → În curs → In Review → Done).</w:t>
       </w:r>
     </w:p>
     <w:p>

</xml_diff>